<commit_message>
feat(access): complete local auth and OCRI access management
Implements verified institutional registration, password-based login, role assignment by approved domain, OCRI-controlled university and external-manager administration, and separated SGMS/SGME navigation.\n\nDocuments Sprint 1 progress, the completed US-01 and US-02 acceptance evidence, login architecture, and the migration history. Next increment: US-04 to US-06, moving calls and requirements from demo data to PostgreSQL with RLS.
</commit_message>
<xml_diff>
--- a/docs/12-plan-de-sprints-sigma-ocri.docx
+++ b/docs/12-plan-de-sprints-sigma-ocri.docx
@@ -298,6 +298,85 @@
           <w:shd w:fill="auto" w:val="clear"/>
           <w:vertAlign w:val="baseline"/>
         </w:rPr>
+        <w:p>
+          <w:r>
+            <w:br w:type="page"/>
+          </w:r>
+        </w:p>
+        <w:p>
+          <w:pPr>
+            <w:pStyle w:val="Heading1"/>
+          </w:pPr>
+          <w:r>
+            <w:t>Avance ejecutado — Sprint 1</w:t>
+          </w:r>
+        </w:p>
+        <w:p>
+          <w:r>
+            <w:t>Durante los dos primeros días se adelantó la base de acceso seguro en Supabase local. El trabajo cubre US-01 y US-02 en desarrollo; la publicación en Supabase Cloud y la aceptación de OCRI siguen pendientes.</w:t>
+          </w:r>
+        </w:p>
+        <w:p>
+          <w:pPr>
+            <w:pStyle w:val="Heading1"/>
+          </w:pPr>
+          <w:r>
+            <w:t>Trabajo realizado</w:t>
+          </w:r>
+        </w:p>
+        <w:p>
+          <w:r>
+            <w:t>• Supabase local con PostgreSQL, Auth, Studio y Mailpit mediante Docker.</w:t>
+          </w:r>
+        </w:p>
+        <w:p>
+          <w:r>
+            <w:t>• Perfiles, roles, universidades, dominios, RLS y funciones administrativas seguras.</w:t>
+          </w:r>
+        </w:p>
+        <w:p>
+          <w:r>
+            <w:t>• Roles finales: ADMIN_OCRI, ESTUDIANTE_UNSAAC, ESTUDIANTE_EXTERNO y GESTOR_EXTERNO.</w:t>
+          </w:r>
+        </w:p>
+        <w:p>
+          <w:r>
+            <w:t>• Bootstrap único de ocri@unsaac.edu.pe como administrador funcional.</w:t>
+          </w:r>
+        </w:p>
+        <w:p>
+          <w:r>
+            <w:t>• Registro con dominio aprobado, verificación por enlace y contraseña personal para ingresos posteriores.</w:t>
+          </w:r>
+        </w:p>
+        <w:p>
+          <w:r>
+            <w:t>• Registro bloqueado para Gmail y dominios sin convenio o asociación aprobada.</w:t>
+          </w:r>
+        </w:p>
+        <w:p>
+          <w:r>
+            <w:t>• Rol base automático para estudiantes; OCRI designa gestores externos directamente.</w:t>
+          </w:r>
+        </w:p>
+        <w:p>
+          <w:r>
+            <w:t>• Panel OCRI para universidades, dominios y designación de gestores; navegación separada entre SGMS, SGME y Administración.</w:t>
+          </w:r>
+        </w:p>
+        <w:p>
+          <w:pPr>
+            <w:pStyle w:val="Heading1"/>
+          </w:pPr>
+          <w:r>
+            <w:t>Evidencias y siguiente paso</w:t>
+          </w:r>
+        </w:p>
+        <w:p>
+          <w:r>
+            <w:t>La compilación npm run build y el lint de base supabase db lint --local finalizaron sin errores. El siguiente incremento es Sprint 2: US-04, US-05 y US-06, para migrar convocatorias y requisitos a PostgreSQL y permitir su consulta controlada.</w:t>
+          </w:r>
+        </w:p>
         <w:sectPr>
           <w:footerReference ns5:id="rId8" w:type="default"/>
           <w:pgSz w:h="15840" w:w="12240" w:orient="portrait"/>

</xml_diff>